<commit_message>
Restore CIRM and Mantra in career timeline and resume
</commit_message>
<xml_diff>
--- a/site/assets/downloads/Nicholas-Roberts-Resume.docx
+++ b/site/assets/downloads/Nicholas-Roberts-Resume.docx
@@ -215,7 +215,7 @@
         <w:rPr>
           <w:b w:val="0"/>
         </w:rPr>
-        <w:t>Owned product roadmaps and vendor delivery for ecommerce storefronts and two React Native mobile apps, expanding mobile purchasing capabilities.</w:t>
+        <w:t>Owned roadmaps and vendor delivery for four ecommerce storefronts and two React Native mobile apps on Shopify, now a major and fast-growing sales channel.</w:t>
       </w:r>
     </w:p>
     <w:p>
@@ -487,7 +487,7 @@
         <w:rPr>
           <w:b w:val="0"/>
         </w:rPr>
-        <w:t>Onboarded 12 Toyota and Lexus bare domains; documented redirect logic, implementation requirements, and pre-launch and post-launch tests while coordinating client business and technical teams.</w:t>
+        <w:t>Onboarded 12 Toyota and Lexus bare domains, documenting redirect logic, implementation requirements, and launch tests with client business and technical teams.</w:t>
       </w:r>
     </w:p>
     <w:p>
@@ -564,13 +564,38 @@
     </w:p>
     <w:p>
       <w:pPr>
-        <w:pStyle w:val="Heading1"/>
+        <w:keepNext/>
+        <w:tabs>
+          <w:tab w:pos="10224" w:val="right"/>
+        </w:tabs>
+        <w:spacing w:after="40"/>
       </w:pPr>
       <w:r>
         <w:rPr>
           <w:b w:val="0"/>
         </w:rPr>
-        <w:t>Earlier experience</w:t>
+      </w:r>
+      <w:r>
+        <w:rPr>
+          <w:b/>
+        </w:rPr>
+        <w:t>California Institute for Regenerative Medicine</w:t>
+      </w:r>
+      <w:r>
+        <w:tab/>
+        <w:t>2014 - 2016</w:t>
+      </w:r>
+    </w:p>
+    <w:p>
+      <w:pPr>
+        <w:keepNext/>
+        <w:spacing w:after="80"/>
+      </w:pPr>
+      <w:r>
+        <w:rPr>
+          <w:b w:val="0"/>
+        </w:rPr>
+        <w:t>Drupal &amp; WordPress Webmaster | San Francisco, CA</w:t>
       </w:r>
     </w:p>
     <w:p>
@@ -582,7 +607,7 @@
         <w:rPr>
           <w:b w:val="0"/>
         </w:rPr>
-        <w:t>California Institute for Regenerative Medicine - Drupal &amp; WordPress Webmaster. Managed a 6,000+ page government web estate, vendor coordination, a mobile-first redesign, and security maintenance.</w:t>
+        <w:t>Owned Drupal and WordPress code, databases, content operations, and security for a government biotechnology agency, spanning 6,000+ pages and 15 content types.</w:t>
       </w:r>
     </w:p>
     <w:p>
@@ -594,7 +619,43 @@
         <w:rPr>
           <w:b w:val="0"/>
         </w:rPr>
-        <w:t>Mantra Resorts - Technical Project Manager. Led the full delivery lifecycle for a three-domain accommodation ecommerce platform with 10,000+ content pages.</w:t>
+        <w:t>Coordinated vendors and a mobile-first redesign; maintained the deployment lifecycle and protected the agency against Drupal security vulnerabilities.</w:t>
+      </w:r>
+    </w:p>
+    <w:p>
+      <w:pPr>
+        <w:keepNext/>
+        <w:tabs>
+          <w:tab w:pos="10224" w:val="right"/>
+        </w:tabs>
+        <w:spacing w:after="40"/>
+      </w:pPr>
+      <w:r>
+        <w:rPr>
+          <w:b w:val="0"/>
+        </w:rPr>
+      </w:r>
+      <w:r>
+        <w:rPr>
+          <w:b/>
+        </w:rPr>
+        <w:t>Mantra Resorts (via Guerrilla Marketing)</w:t>
+      </w:r>
+      <w:r>
+        <w:tab/>
+        <w:t>2007</w:t>
+      </w:r>
+    </w:p>
+    <w:p>
+      <w:pPr>
+        <w:keepNext/>
+        <w:spacing w:after="80"/>
+      </w:pPr>
+      <w:r>
+        <w:rPr>
+          <w:b w:val="0"/>
+        </w:rPr>
+        <w:t>Technical Project Manager | Queensland, Australia</w:t>
       </w:r>
     </w:p>
     <w:p>
@@ -606,7 +667,67 @@
         <w:rPr>
           <w:b w:val="0"/>
         </w:rPr>
-        <w:t>Nationwide News / News Corp - Webmaster. Supported web publishing and commercial projects across 30 news properties, working with editorial, advertising, IT, and management.</w:t>
+        <w:t>Led the full delivery lifecycle for accommodation ecommerce across three domains and 10,000+ content pages, from requirements and development through testing, launch, and operations.</w:t>
+      </w:r>
+    </w:p>
+    <w:p>
+      <w:pPr>
+        <w:pStyle w:val="ListBullet"/>
+        <w:keepLines/>
+      </w:pPr>
+      <w:r>
+        <w:rPr>
+          <w:b w:val="0"/>
+        </w:rPr>
+        <w:t>Coordinated 10 developers across a nine-month delivery, aligning hotel, marketing, and development stakeholders.</w:t>
+      </w:r>
+    </w:p>
+    <w:p>
+      <w:pPr>
+        <w:keepNext/>
+        <w:tabs>
+          <w:tab w:pos="10224" w:val="right"/>
+        </w:tabs>
+        <w:spacing w:after="40"/>
+      </w:pPr>
+      <w:r>
+        <w:rPr>
+          <w:b w:val="0"/>
+        </w:rPr>
+      </w:r>
+      <w:r>
+        <w:rPr>
+          <w:b/>
+        </w:rPr>
+        <w:t>News Corp / Nationwide News</w:t>
+      </w:r>
+      <w:r>
+        <w:tab/>
+        <w:t>2000 - 2003</w:t>
+      </w:r>
+    </w:p>
+    <w:p>
+      <w:pPr>
+        <w:keepNext/>
+        <w:spacing w:after="80"/>
+      </w:pPr>
+      <w:r>
+        <w:rPr>
+          <w:b w:val="0"/>
+        </w:rPr>
+        <w:t>Webmaster | Sydney, Australia</w:t>
+      </w:r>
+    </w:p>
+    <w:p>
+      <w:pPr>
+        <w:pStyle w:val="ListBullet"/>
+        <w:keepLines/>
+      </w:pPr>
+      <w:r>
+        <w:rPr>
+          <w:b w:val="0"/>
+        </w:rPr>
+        <w:t>Supported multimedia, web publishing, and ecommerce projects across 30 news properties, working with editorial, advertising, IT, management, and executive teams.</w:t>
       </w:r>
     </w:p>
     <w:p>
@@ -650,7 +771,7 @@
         <w:rPr>
           <w:b w:val="0"/>
         </w:rPr>
-        <w:t xml:space="preserve">Documented a banking modernization proof of concept that exposed missing third-party API dependencies and informed scope, vendor discussions, and the delivery roadmap. </w:t>
+        <w:t xml:space="preserve">Documented a banking integration proof of concept that exposed third-party API gaps and shaped scope, vendor discussions, and the roadmap. </w:t>
       </w:r>
       <w:hyperlink r:id="rId14">
         <w:r>

</xml_diff>

<commit_message>
Add product and team leadership tagline to resume
</commit_message>
<xml_diff>
--- a/site/assets/downloads/Nicholas-Roberts-Resume.docx
+++ b/site/assets/downloads/Nicholas-Roberts-Resume.docx
@@ -22,6 +22,22 @@
           <w:b w:val="0"/>
         </w:rPr>
         <w:t>AI Transformation and Technology Operations</w:t>
+      </w:r>
+    </w:p>
+    <w:p>
+      <w:pPr>
+        <w:keepNext/>
+        <w:spacing w:before="0" w:after="120" w:line="252" w:lineRule="auto"/>
+      </w:pPr>
+      <w:r>
+        <w:rPr>
+          <w:b/>
+          <w:color w:val="000000"/>
+          <w:sz w:val="22"/>
+        </w:rPr>
+        <w:t>I build products that customers buy and people love</w:t>
+        <w:br/>
+        <w:t>and lead the cross-functional teams that do it.</w:t>
       </w:r>
     </w:p>
     <w:p>

</xml_diff>

<commit_message>
Add blue-suit portrait to resume header
</commit_message>
<xml_diff>
--- a/site/assets/downloads/Nicholas-Roberts-Resume.docx
+++ b/site/assets/downloads/Nicholas-Roberts-Resume.docx
@@ -11,6 +11,49 @@
           <w:b w:val="0"/>
         </w:rPr>
         <w:t>Nicholas Roberts</w:t>
+      </w:r>
+      <w:r>
+        <w:drawing>
+          <wp:anchor distT="0" distB="73152" distL="164592" distR="0" simplePos="0" relativeHeight="251658240" behindDoc="0" locked="0" layoutInCell="1" allowOverlap="0">
+            <wp:simplePos x="0" y="0"/>
+            <wp:positionH relativeFrom="margin">
+              <wp:align>right</wp:align>
+            </wp:positionH>
+            <wp:positionV relativeFrom="paragraph">
+              <wp:posOffset>0</wp:posOffset>
+            </wp:positionV>
+            <wp:extent cx="1234440" cy="1234440"/>
+            <wp:effectExtent l="0" t="0" r="0" b="0"/>
+            <wp:wrapSquare wrapText="bothSides"/>
+            <wp:docPr id="1" name="Nicholas Roberts portrait" descr="Portrait of Nicholas Roberts wearing a navy blue jacket"/>
+            <wp:cNvGraphicFramePr xmlns:a="http://schemas.openxmlformats.org/drawingml/2006/main">
+              <a:graphicFrameLocks noChangeAspect="1"/>
+            </wp:cNvGraphicFramePr>
+            <a:graphic xmlns:a="http://schemas.openxmlformats.org/drawingml/2006/main" xmlns:pic="http://schemas.openxmlformats.org/drawingml/2006/picture">
+              <a:graphicData uri="http://schemas.openxmlformats.org/drawingml/2006/picture">
+                <pic:pic>
+                  <pic:nvPicPr>
+                    <pic:cNvPr id="0" name="resume-blue-jacket.png"/>
+                    <pic:cNvPicPr/>
+                  </pic:nvPicPr>
+                  <pic:blipFill>
+                    <a:blip r:embed="rId15"/>
+                    <a:stretch>
+                      <a:fillRect/>
+                    </a:stretch>
+                  </pic:blipFill>
+                  <pic:spPr>
+                    <a:xfrm>
+                      <a:off x="0" y="0"/>
+                      <a:ext cx="1234440" cy="1234440"/>
+                    </a:xfrm>
+                    <a:prstGeom prst="rect"/>
+                  </pic:spPr>
+                </pic:pic>
+              </a:graphicData>
+            </a:graphic>
+          </wp:anchor>
+        </w:drawing>
       </w:r>
     </w:p>
     <w:p>

</xml_diff>